<commit_message>
adição de modelos de patente de inovação
os assetes estão preenchidos com os arquivos de modelos de inovação, juntamente, foi feito os modelos validadores de dados no pydantic juntamente com o exportador atualizado.

falta: testes conversão em PDF direto.
</commit_message>
<xml_diff>
--- a/Assets/templates/arquivos_patente_pi/01_template_PI_relatorio_descritivo.docx
+++ b/Assets/templates/arquivos_patente_pi/01_template_PI_relatorio_descritivo.docx
@@ -64,6 +64,7 @@
     <w:p>
       <w:pPr>
         <w:pStyle w:val="AppBody-Heading"/>
+        <w:jc w:val="both"/>
         <w:rPr>
           <w:sz w:val="24"/>
           <w:szCs w:val="24"/>
@@ -89,14 +90,14 @@
     <w:p>
       <w:pPr>
         <w:pStyle w:val="AppBody-Heading"/>
-        <w:rPr>
-          <w:b w:val="0"/>
-          <w:bCs/>
-          <w:sz w:val="24"/>
-          <w:szCs w:val="24"/>
-        </w:rPr>
-      </w:pPr>
-      <w:proofErr w:type="gramStart"/>
+        <w:jc w:val="both"/>
+        <w:rPr>
+          <w:b w:val="0"/>
+          <w:bCs/>
+          <w:sz w:val="24"/>
+          <w:szCs w:val="24"/>
+        </w:rPr>
+      </w:pPr>
       <w:r>
         <w:rPr>
           <w:b w:val="0"/>
@@ -114,27 +115,7 @@
           <w:sz w:val="24"/>
           <w:szCs w:val="24"/>
         </w:rPr>
-        <w:t>relatorio</w:t>
-      </w:r>
-      <w:proofErr w:type="gramEnd"/>
-      <w:r>
-        <w:rPr>
-          <w:b w:val="0"/>
-          <w:bCs/>
-          <w:sz w:val="24"/>
-          <w:szCs w:val="24"/>
-        </w:rPr>
-        <w:t>.campo_da_</w:t>
-      </w:r>
-      <w:proofErr w:type="gramStart"/>
-      <w:r>
-        <w:rPr>
-          <w:b w:val="0"/>
-          <w:bCs/>
-          <w:sz w:val="24"/>
-          <w:szCs w:val="24"/>
-        </w:rPr>
-        <w:t>invencao</w:t>
+        <w:t>relatorio.campo_da_invencao</w:t>
       </w:r>
       <w:proofErr w:type="spellEnd"/>
       <w:r>
@@ -144,17 +125,7 @@
           <w:sz w:val="24"/>
           <w:szCs w:val="24"/>
         </w:rPr>
-        <w:t xml:space="preserve"> }</w:t>
-      </w:r>
-      <w:proofErr w:type="gramEnd"/>
-      <w:r>
-        <w:rPr>
-          <w:b w:val="0"/>
-          <w:bCs/>
-          <w:sz w:val="24"/>
-          <w:szCs w:val="24"/>
-        </w:rPr>
-        <w:t>}</w:t>
+        <w:t xml:space="preserve"> }}</w:t>
       </w:r>
     </w:p>
     <w:p>
@@ -163,6 +134,7 @@
         <w:tabs>
           <w:tab w:val="left" w:pos="3795"/>
         </w:tabs>
+        <w:jc w:val="both"/>
         <w:rPr>
           <w:sz w:val="24"/>
           <w:szCs w:val="24"/>
@@ -207,14 +179,14 @@
         <w:tabs>
           <w:tab w:val="left" w:pos="3795"/>
         </w:tabs>
-        <w:rPr>
-          <w:b w:val="0"/>
-          <w:bCs/>
-          <w:sz w:val="24"/>
-          <w:szCs w:val="24"/>
-        </w:rPr>
-      </w:pPr>
-      <w:proofErr w:type="gramStart"/>
+        <w:jc w:val="both"/>
+        <w:rPr>
+          <w:b w:val="0"/>
+          <w:bCs/>
+          <w:sz w:val="24"/>
+          <w:szCs w:val="24"/>
+        </w:rPr>
+      </w:pPr>
       <w:r>
         <w:rPr>
           <w:b w:val="0"/>
@@ -232,27 +204,7 @@
           <w:sz w:val="24"/>
           <w:szCs w:val="24"/>
         </w:rPr>
-        <w:t>relatorio</w:t>
-      </w:r>
-      <w:proofErr w:type="gramEnd"/>
-      <w:r>
-        <w:rPr>
-          <w:b w:val="0"/>
-          <w:bCs/>
-          <w:sz w:val="24"/>
-          <w:szCs w:val="24"/>
-        </w:rPr>
-        <w:t>.estado_da_</w:t>
-      </w:r>
-      <w:proofErr w:type="gramStart"/>
-      <w:r>
-        <w:rPr>
-          <w:b w:val="0"/>
-          <w:bCs/>
-          <w:sz w:val="24"/>
-          <w:szCs w:val="24"/>
-        </w:rPr>
-        <w:t>tecnica</w:t>
+        <w:t>relatorio.estado_da_tecnica</w:t>
       </w:r>
       <w:proofErr w:type="spellEnd"/>
       <w:r>
@@ -262,17 +214,7 @@
           <w:sz w:val="24"/>
           <w:szCs w:val="24"/>
         </w:rPr>
-        <w:t xml:space="preserve"> }</w:t>
-      </w:r>
-      <w:proofErr w:type="gramEnd"/>
-      <w:r>
-        <w:rPr>
-          <w:b w:val="0"/>
-          <w:bCs/>
-          <w:sz w:val="24"/>
-          <w:szCs w:val="24"/>
-        </w:rPr>
-        <w:t>}</w:t>
+        <w:t xml:space="preserve"> }}</w:t>
       </w:r>
     </w:p>
     <w:p>
@@ -281,14 +223,14 @@
         <w:tabs>
           <w:tab w:val="left" w:pos="3795"/>
         </w:tabs>
-        <w:rPr>
-          <w:b w:val="0"/>
-          <w:bCs/>
-          <w:sz w:val="24"/>
-          <w:szCs w:val="24"/>
-        </w:rPr>
-      </w:pPr>
-      <w:proofErr w:type="gramStart"/>
+        <w:jc w:val="both"/>
+        <w:rPr>
+          <w:b w:val="0"/>
+          <w:bCs/>
+          <w:sz w:val="24"/>
+          <w:szCs w:val="24"/>
+        </w:rPr>
+      </w:pPr>
       <w:r>
         <w:rPr>
           <w:b w:val="0"/>
@@ -306,27 +248,7 @@
           <w:sz w:val="24"/>
           <w:szCs w:val="24"/>
         </w:rPr>
-        <w:t>relatorio</w:t>
-      </w:r>
-      <w:proofErr w:type="gramEnd"/>
-      <w:r>
-        <w:rPr>
-          <w:b w:val="0"/>
-          <w:bCs/>
-          <w:sz w:val="24"/>
-          <w:szCs w:val="24"/>
-        </w:rPr>
-        <w:t>.problema_e_</w:t>
-      </w:r>
-      <w:proofErr w:type="gramStart"/>
-      <w:r>
-        <w:rPr>
-          <w:b w:val="0"/>
-          <w:bCs/>
-          <w:sz w:val="24"/>
-          <w:szCs w:val="24"/>
-        </w:rPr>
-        <w:t>vantagens</w:t>
+        <w:t>relatorio.problema_e_vantagens</w:t>
       </w:r>
       <w:proofErr w:type="spellEnd"/>
       <w:r>
@@ -336,22 +258,13 @@
           <w:sz w:val="24"/>
           <w:szCs w:val="24"/>
         </w:rPr>
-        <w:t xml:space="preserve"> }</w:t>
-      </w:r>
-      <w:proofErr w:type="gramEnd"/>
-      <w:r>
-        <w:rPr>
-          <w:b w:val="0"/>
-          <w:bCs/>
-          <w:sz w:val="24"/>
-          <w:szCs w:val="24"/>
-        </w:rPr>
-        <w:t>}</w:t>
+        <w:t xml:space="preserve"> }}</w:t>
       </w:r>
     </w:p>
     <w:p>
       <w:pPr>
         <w:pStyle w:val="AppBody-Heading"/>
+        <w:jc w:val="both"/>
         <w:rPr>
           <w:sz w:val="24"/>
           <w:szCs w:val="24"/>
@@ -414,6 +327,7 @@
     <w:p>
       <w:pPr>
         <w:pStyle w:val="AppBody-Heading"/>
+        <w:jc w:val="both"/>
         <w:rPr>
           <w:b w:val="0"/>
           <w:bCs/>
@@ -431,7 +345,6 @@
         <w:t xml:space="preserve">{% for d in </w:t>
       </w:r>
       <w:proofErr w:type="spellStart"/>
-      <w:proofErr w:type="gramStart"/>
       <w:r>
         <w:rPr>
           <w:b w:val="0"/>
@@ -442,7 +355,6 @@
         <w:t>relatorio.desenhos</w:t>
       </w:r>
       <w:proofErr w:type="spellEnd"/>
-      <w:proofErr w:type="gramEnd"/>
       <w:r>
         <w:rPr>
           <w:b w:val="0"/>
@@ -456,6 +368,7 @@
     <w:p>
       <w:pPr>
         <w:pStyle w:val="AppBody-Heading"/>
+        <w:jc w:val="both"/>
         <w:rPr>
           <w:b w:val="0"/>
           <w:bCs/>
@@ -490,17 +403,7 @@
           <w:sz w:val="24"/>
           <w:szCs w:val="24"/>
         </w:rPr>
-        <w:t xml:space="preserve"> </w:t>
-      </w:r>
-      <w:proofErr w:type="gramStart"/>
-      <w:r>
-        <w:rPr>
-          <w:b w:val="0"/>
-          <w:bCs/>
-          <w:sz w:val="24"/>
-          <w:szCs w:val="24"/>
-        </w:rPr>
-        <w:t xml:space="preserve">{{ </w:t>
+        <w:t xml:space="preserve"> {{ </w:t>
       </w:r>
       <w:proofErr w:type="spellStart"/>
       <w:r>
@@ -510,27 +413,7 @@
           <w:sz w:val="24"/>
           <w:szCs w:val="24"/>
         </w:rPr>
-        <w:t>d</w:t>
-      </w:r>
-      <w:proofErr w:type="gramEnd"/>
-      <w:r>
-        <w:rPr>
-          <w:b w:val="0"/>
-          <w:bCs/>
-          <w:sz w:val="24"/>
-          <w:szCs w:val="24"/>
-        </w:rPr>
-        <w:t>.numero_</w:t>
-      </w:r>
-      <w:proofErr w:type="gramStart"/>
-      <w:r>
-        <w:rPr>
-          <w:b w:val="0"/>
-          <w:bCs/>
-          <w:sz w:val="24"/>
-          <w:szCs w:val="24"/>
-        </w:rPr>
-        <w:t>figura</w:t>
+        <w:t>d.numero_figura</w:t>
       </w:r>
       <w:proofErr w:type="spellEnd"/>
       <w:r>
@@ -540,27 +423,7 @@
           <w:sz w:val="24"/>
           <w:szCs w:val="24"/>
         </w:rPr>
-        <w:t xml:space="preserve"> }</w:t>
-      </w:r>
-      <w:proofErr w:type="gramEnd"/>
-      <w:r>
-        <w:rPr>
-          <w:b w:val="0"/>
-          <w:bCs/>
-          <w:sz w:val="24"/>
-          <w:szCs w:val="24"/>
-        </w:rPr>
-        <w:t xml:space="preserve">} </w:t>
-      </w:r>
-      <w:proofErr w:type="gramStart"/>
-      <w:r>
-        <w:rPr>
-          <w:b w:val="0"/>
-          <w:bCs/>
-          <w:sz w:val="24"/>
-          <w:szCs w:val="24"/>
-        </w:rPr>
-        <w:t xml:space="preserve">{{ </w:t>
+        <w:t xml:space="preserve"> }} {{ </w:t>
       </w:r>
       <w:proofErr w:type="spellStart"/>
       <w:r>
@@ -570,27 +433,7 @@
           <w:sz w:val="24"/>
           <w:szCs w:val="24"/>
         </w:rPr>
-        <w:t>d</w:t>
-      </w:r>
-      <w:proofErr w:type="gramEnd"/>
-      <w:r>
-        <w:rPr>
-          <w:b w:val="0"/>
-          <w:bCs/>
-          <w:sz w:val="24"/>
-          <w:szCs w:val="24"/>
-        </w:rPr>
-        <w:t>.descricao_</w:t>
-      </w:r>
-      <w:proofErr w:type="gramStart"/>
-      <w:r>
-        <w:rPr>
-          <w:b w:val="0"/>
-          <w:bCs/>
-          <w:sz w:val="24"/>
-          <w:szCs w:val="24"/>
-        </w:rPr>
-        <w:t>breve</w:t>
+        <w:t>d.descricao_breve</w:t>
       </w:r>
       <w:proofErr w:type="spellEnd"/>
       <w:r>
@@ -600,17 +443,7 @@
           <w:sz w:val="24"/>
           <w:szCs w:val="24"/>
         </w:rPr>
-        <w:t xml:space="preserve"> }</w:t>
-      </w:r>
-      <w:proofErr w:type="gramEnd"/>
-      <w:r>
-        <w:rPr>
-          <w:b w:val="0"/>
-          <w:bCs/>
-          <w:sz w:val="24"/>
-          <w:szCs w:val="24"/>
-        </w:rPr>
-        <w:t>}</w:t>
+        <w:t xml:space="preserve"> }}</w:t>
       </w:r>
     </w:p>
     <w:p>
@@ -619,6 +452,7 @@
         <w:tabs>
           <w:tab w:val="left" w:pos="5055"/>
         </w:tabs>
+        <w:jc w:val="both"/>
         <w:rPr>
           <w:b w:val="0"/>
           <w:bCs/>
@@ -654,20 +488,12 @@
           <w:szCs w:val="24"/>
         </w:rPr>
         <w:t xml:space="preserve"> %}</w:t>
-      </w:r>
-      <w:r>
-        <w:rPr>
-          <w:b w:val="0"/>
-          <w:bCs/>
-          <w:sz w:val="24"/>
-          <w:szCs w:val="24"/>
-        </w:rPr>
-        <w:tab/>
       </w:r>
     </w:p>
     <w:p>
       <w:pPr>
         <w:pStyle w:val="AppBody-Heading"/>
+        <w:jc w:val="both"/>
         <w:rPr>
           <w:sz w:val="24"/>
           <w:szCs w:val="24"/>
@@ -694,6 +520,7 @@
     <w:p>
       <w:pPr>
         <w:pStyle w:val="AppBody-Heading"/>
+        <w:jc w:val="both"/>
         <w:rPr>
           <w:b w:val="0"/>
           <w:bCs/>
@@ -731,35 +558,14 @@
         <w:t xml:space="preserve"> in </w:t>
       </w:r>
       <w:proofErr w:type="spellStart"/>
-      <w:proofErr w:type="gramStart"/>
-      <w:r>
-        <w:rPr>
-          <w:b w:val="0"/>
-          <w:bCs/>
-          <w:sz w:val="24"/>
-          <w:szCs w:val="24"/>
-        </w:rPr>
-        <w:t>relatorio.paragrafos</w:t>
-      </w:r>
-      <w:proofErr w:type="gramEnd"/>
-      <w:r>
-        <w:rPr>
-          <w:b w:val="0"/>
-          <w:bCs/>
-          <w:sz w:val="24"/>
-          <w:szCs w:val="24"/>
-        </w:rPr>
-        <w:t>_</w:t>
-      </w:r>
-      <w:proofErr w:type="gramStart"/>
-      <w:r>
-        <w:rPr>
-          <w:b w:val="0"/>
-          <w:bCs/>
-          <w:sz w:val="24"/>
-          <w:szCs w:val="24"/>
-        </w:rPr>
-        <w:t>descricao</w:t>
+      <w:r>
+        <w:rPr>
+          <w:b w:val="0"/>
+          <w:bCs/>
+          <w:sz w:val="24"/>
+          <w:szCs w:val="24"/>
+        </w:rPr>
+        <w:t>relatorio.paragrafos_descricao</w:t>
       </w:r>
       <w:proofErr w:type="spellEnd"/>
       <w:r>
@@ -769,30 +575,20 @@
           <w:sz w:val="24"/>
           <w:szCs w:val="24"/>
         </w:rPr>
-        <w:t xml:space="preserve"> %}</w:t>
-      </w:r>
-      <w:proofErr w:type="gramEnd"/>
-      <w:r>
-        <w:rPr>
-          <w:b w:val="0"/>
-          <w:bCs/>
-          <w:sz w:val="24"/>
-          <w:szCs w:val="24"/>
-        </w:rPr>
-        <w:t xml:space="preserve"> </w:t>
+        <w:t xml:space="preserve"> %} </w:t>
       </w:r>
     </w:p>
     <w:p>
       <w:pPr>
         <w:pStyle w:val="AppBody-Heading"/>
-        <w:rPr>
-          <w:b w:val="0"/>
-          <w:bCs/>
-          <w:sz w:val="24"/>
-          <w:szCs w:val="24"/>
-        </w:rPr>
-      </w:pPr>
-      <w:proofErr w:type="gramStart"/>
+        <w:jc w:val="both"/>
+        <w:rPr>
+          <w:b w:val="0"/>
+          <w:bCs/>
+          <w:sz w:val="24"/>
+          <w:szCs w:val="24"/>
+        </w:rPr>
+      </w:pPr>
       <w:r>
         <w:rPr>
           <w:b w:val="0"/>
@@ -813,7 +609,6 @@
         <w:t>paragrafo</w:t>
       </w:r>
       <w:proofErr w:type="spellEnd"/>
-      <w:proofErr w:type="gramEnd"/>
       <w:r>
         <w:rPr>
           <w:b w:val="0"/>
@@ -827,6 +622,7 @@
     <w:p>
       <w:pPr>
         <w:pStyle w:val="AppBody-Heading"/>
+        <w:jc w:val="both"/>
         <w:rPr>
           <w:b w:val="0"/>
           <w:bCs/>
@@ -868,6 +664,7 @@
     <w:p>
       <w:pPr>
         <w:pStyle w:val="AppBody-Heading"/>
+        <w:jc w:val="both"/>
         <w:rPr>
           <w:sz w:val="24"/>
           <w:szCs w:val="24"/>
@@ -925,6 +722,7 @@
     <w:p>
       <w:pPr>
         <w:pStyle w:val="AppBody-Heading"/>
+        <w:jc w:val="both"/>
         <w:rPr>
           <w:b w:val="0"/>
           <w:bCs/>

</xml_diff>